<commit_message>
feat: enhance DOCX processing to classify captions based on preceding table or image blocks
</commit_message>
<xml_diff>
--- a/mineru/model/docx/test.docx
+++ b/mineru/model/docx/test.docx
@@ -350,7 +350,7 @@
           <w:rFonts w:ascii="宋体" w:hAnsi="宋体" w:cs="宋体" w:hint="eastAsia"/>
           <w:szCs w:val="24"/>
         </w:rPr>
-        <w:t>本合同双方应加盖骑缝章。</w:t>
+        <w:t>自双方签章并经省政府采购中心审核编号后生效。</w:t>
       </w:r>
     </w:p>
     <w:p>
@@ -561,6 +561,452 @@
     <w:p>
       <w:pPr>
         <w:numPr>
+          <w:ilvl w:val="3"/>
+          <w:numId w:val="2"/>
+        </w:numPr>
+        <w:ind w:firstLine="480"/>
+        <w:rPr>
+          <w:rFonts w:ascii="宋体" w:hAnsi="宋体" w:cs="宋体"/>
+          <w:szCs w:val="24"/>
+        </w:rPr>
+      </w:pPr>
+      <w:r>
+        <w:rPr>
+          <w:rFonts w:ascii="宋体" w:hAnsi="宋体" w:cs="宋体" w:hint="eastAsia"/>
+          <w:szCs w:val="24"/>
+        </w:rPr>
+        <w:t>合同一式四份，自双方签</w:t>
+      </w:r>
+      <w:r>
+        <w:rPr>
+          <w:rFonts w:ascii="宋体" w:hAnsi="宋体" w:cs="宋体" w:hint="eastAsia"/>
+          <w:szCs w:val="24"/>
+        </w:rPr>
+        <w:t>公式后接正文</w:t>
+      </w:r>
+    </w:p>
+    <w:p>
+      <w:pPr>
+        <w:numPr>
+          <w:ilvl w:val="2"/>
+          <w:numId w:val="2"/>
+        </w:numPr>
+        <w:ind w:firstLine="480"/>
+        <w:rPr>
+          <w:rFonts w:ascii="宋体" w:hAnsi="宋体" w:cs="宋体"/>
+          <w:szCs w:val="24"/>
+        </w:rPr>
+      </w:pPr>
+      <w:r>
+        <w:rPr>
+          <w:rFonts w:ascii="宋体" w:hAnsi="宋体" w:cs="宋体" w:hint="eastAsia"/>
+          <w:szCs w:val="24"/>
+        </w:rPr>
+        <w:t>本合同双方应加盖骑缝章。</w:t>
+      </w:r>
+    </w:p>
+    <w:p>
+      <w:pPr>
+        <w:numPr>
+          <w:ilvl w:val="3"/>
+          <w:numId w:val="2"/>
+        </w:numPr>
+        <w:ind w:firstLine="480"/>
+        <w:rPr>
+          <w:rFonts w:ascii="宋体" w:hAnsi="宋体" w:cs="宋体"/>
+          <w:szCs w:val="24"/>
+        </w:rPr>
+      </w:pPr>
+      <w:r>
+        <w:rPr>
+          <w:rFonts w:ascii="宋体" w:hAnsi="宋体" w:cs="宋体" w:hint="eastAsia"/>
+          <w:szCs w:val="24"/>
+        </w:rPr>
+        <w:t>最里层列表</w:t>
+      </w:r>
+      <m:oMath>
+        <m:sSup>
+          <m:sSupPr>
+            <m:ctrlPr>
+              <w:rPr>
+                <w:rFonts w:ascii="Cambria Math" w:hAnsi="Cambria Math" w:cs="宋体"/>
+                <w:szCs w:val="24"/>
+              </w:rPr>
+            </m:ctrlPr>
+          </m:sSupPr>
+          <m:e>
+            <m:d>
+              <m:dPr>
+                <m:ctrlPr>
+                  <w:rPr>
+                    <w:rFonts w:ascii="Cambria Math" w:hAnsi="Cambria Math" w:cs="宋体"/>
+                    <w:szCs w:val="24"/>
+                  </w:rPr>
+                </m:ctrlPr>
+              </m:dPr>
+              <m:e>
+                <m:r>
+                  <w:rPr>
+                    <w:rFonts w:ascii="Cambria Math" w:hAnsi="Cambria Math" w:cs="宋体"/>
+                    <w:szCs w:val="24"/>
+                  </w:rPr>
+                  <m:t>x+a</m:t>
+                </m:r>
+              </m:e>
+            </m:d>
+          </m:e>
+          <m:sup>
+            <m:r>
+              <w:rPr>
+                <w:rFonts w:ascii="Cambria Math" w:hAnsi="Cambria Math" w:cs="宋体"/>
+                <w:szCs w:val="24"/>
+              </w:rPr>
+              <m:t>n</m:t>
+            </m:r>
+          </m:sup>
+        </m:sSup>
+        <m:r>
+          <w:rPr>
+            <w:rFonts w:ascii="Cambria Math" w:eastAsia="Cambria Math" w:hAnsi="Cambria Math" w:cs="Cambria Math"/>
+            <w:szCs w:val="24"/>
+          </w:rPr>
+          <m:t>=</m:t>
+        </m:r>
+        <m:nary>
+          <m:naryPr>
+            <m:chr m:val="∑"/>
+            <m:grow m:val="1"/>
+            <m:ctrlPr>
+              <w:rPr>
+                <w:rFonts w:ascii="Cambria Math" w:hAnsi="Cambria Math" w:cs="宋体"/>
+                <w:szCs w:val="24"/>
+              </w:rPr>
+            </m:ctrlPr>
+          </m:naryPr>
+          <m:sub>
+            <m:r>
+              <w:rPr>
+                <w:rFonts w:ascii="Cambria Math" w:eastAsia="Cambria Math" w:hAnsi="Cambria Math" w:cs="Cambria Math"/>
+                <w:szCs w:val="24"/>
+              </w:rPr>
+              <m:t>k=0</m:t>
+            </m:r>
+          </m:sub>
+          <m:sup>
+            <m:r>
+              <w:rPr>
+                <w:rFonts w:ascii="Cambria Math" w:eastAsia="Cambria Math" w:hAnsi="Cambria Math" w:cs="Cambria Math"/>
+                <w:szCs w:val="24"/>
+              </w:rPr>
+              <m:t>n</m:t>
+            </m:r>
+          </m:sup>
+          <m:e>
+            <m:d>
+              <m:dPr>
+                <m:ctrlPr>
+                  <w:rPr>
+                    <w:rFonts w:ascii="Cambria Math" w:hAnsi="Cambria Math" w:cs="宋体"/>
+                    <w:szCs w:val="24"/>
+                  </w:rPr>
+                </m:ctrlPr>
+              </m:dPr>
+              <m:e>
+                <m:f>
+                  <m:fPr>
+                    <m:type m:val="noBar"/>
+                    <m:ctrlPr>
+                      <w:rPr>
+                        <w:rFonts w:ascii="Cambria Math" w:hAnsi="Cambria Math" w:cs="宋体"/>
+                        <w:szCs w:val="24"/>
+                      </w:rPr>
+                    </m:ctrlPr>
+                  </m:fPr>
+                  <m:num>
+                    <m:r>
+                      <w:rPr>
+                        <w:rFonts w:ascii="Cambria Math" w:eastAsia="Cambria Math" w:hAnsi="Cambria Math" w:cs="Cambria Math"/>
+                        <w:szCs w:val="24"/>
+                      </w:rPr>
+                      <m:t>n</m:t>
+                    </m:r>
+                  </m:num>
+                  <m:den>
+                    <m:r>
+                      <w:rPr>
+                        <w:rFonts w:ascii="Cambria Math" w:eastAsia="Cambria Math" w:hAnsi="Cambria Math" w:cs="Cambria Math"/>
+                        <w:szCs w:val="24"/>
+                      </w:rPr>
+                      <m:t>k</m:t>
+                    </m:r>
+                  </m:den>
+                </m:f>
+              </m:e>
+            </m:d>
+            <m:sSup>
+              <m:sSupPr>
+                <m:ctrlPr>
+                  <w:rPr>
+                    <w:rFonts w:ascii="Cambria Math" w:hAnsi="Cambria Math" w:cs="宋体"/>
+                    <w:szCs w:val="24"/>
+                  </w:rPr>
+                </m:ctrlPr>
+              </m:sSupPr>
+              <m:e>
+                <m:r>
+                  <w:rPr>
+                    <w:rFonts w:ascii="Cambria Math" w:eastAsia="Cambria Math" w:hAnsi="Cambria Math" w:cs="Cambria Math"/>
+                    <w:szCs w:val="24"/>
+                  </w:rPr>
+                  <m:t>x</m:t>
+                </m:r>
+              </m:e>
+              <m:sup>
+                <m:r>
+                  <w:rPr>
+                    <w:rFonts w:ascii="Cambria Math" w:eastAsia="Cambria Math" w:hAnsi="Cambria Math" w:cs="Cambria Math"/>
+                    <w:szCs w:val="24"/>
+                  </w:rPr>
+                  <m:t>k</m:t>
+                </m:r>
+              </m:sup>
+            </m:sSup>
+            <m:sSup>
+              <m:sSupPr>
+                <m:ctrlPr>
+                  <w:rPr>
+                    <w:rFonts w:ascii="Cambria Math" w:hAnsi="Cambria Math" w:cs="宋体"/>
+                    <w:szCs w:val="24"/>
+                  </w:rPr>
+                </m:ctrlPr>
+              </m:sSupPr>
+              <m:e>
+                <m:r>
+                  <w:rPr>
+                    <w:rFonts w:ascii="Cambria Math" w:eastAsia="Cambria Math" w:hAnsi="Cambria Math" w:cs="Cambria Math"/>
+                    <w:szCs w:val="24"/>
+                  </w:rPr>
+                  <m:t>a</m:t>
+                </m:r>
+              </m:e>
+              <m:sup>
+                <m:r>
+                  <w:rPr>
+                    <w:rFonts w:ascii="Cambria Math" w:eastAsia="Cambria Math" w:hAnsi="Cambria Math" w:cs="Cambria Math"/>
+                    <w:szCs w:val="24"/>
+                  </w:rPr>
+                  <m:t>n-k</m:t>
+                </m:r>
+              </m:sup>
+            </m:sSup>
+          </m:e>
+        </m:nary>
+      </m:oMath>
+      <w:r>
+        <w:rPr>
+          <w:rFonts w:ascii="宋体" w:hAnsi="宋体" w:cs="宋体" w:hint="eastAsia"/>
+          <w:szCs w:val="24"/>
+        </w:rPr>
+        <w:t>行内公式后接正文</w:t>
+      </w:r>
+    </w:p>
+    <w:p>
+      <w:pPr>
+        <w:numPr>
+          <w:ilvl w:val="3"/>
+          <w:numId w:val="2"/>
+        </w:numPr>
+        <w:ind w:firstLine="480"/>
+        <w:rPr>
+          <w:rFonts w:ascii="宋体" w:hAnsi="宋体" w:cs="宋体"/>
+          <w:szCs w:val="24"/>
+        </w:rPr>
+      </w:pPr>
+      <w:r>
+        <w:rPr>
+          <w:rFonts w:ascii="宋体" w:hAnsi="宋体" w:cs="宋体" w:hint="eastAsia"/>
+          <w:szCs w:val="24"/>
+        </w:rPr>
+        <w:t>合同一式四份，自双方签</w:t>
+      </w:r>
+    </w:p>
+    <w:p>
+      <w:pPr>
+        <w:numPr>
+          <w:ilvl w:val="2"/>
+          <w:numId w:val="2"/>
+        </w:numPr>
+        <w:ind w:firstLine="480"/>
+        <w:rPr>
+          <w:rFonts w:ascii="宋体" w:hAnsi="宋体" w:cs="宋体"/>
+          <w:szCs w:val="24"/>
+        </w:rPr>
+      </w:pPr>
+      <w:r>
+        <w:rPr>
+          <w:rFonts w:ascii="宋体" w:hAnsi="宋体" w:cs="宋体" w:hint="eastAsia"/>
+          <w:szCs w:val="24"/>
+        </w:rPr>
+        <w:t>文本超链接支持由</w:t>
+      </w:r>
+      <w:hyperlink r:id="rId9" w:history="1">
+        <w:r>
+          <w:rPr>
+            <w:rFonts w:hint="eastAsia"/>
+          </w:rPr>
+          <w:t>双方依法</w:t>
+        </w:r>
+      </w:hyperlink>
+      <w:r>
+        <w:rPr>
+          <w:rFonts w:ascii="宋体" w:hAnsi="宋体" w:cs="宋体" w:hint="eastAsia"/>
+          <w:szCs w:val="24"/>
+        </w:rPr>
+        <w:t>订立补充</w:t>
+      </w:r>
+      <m:oMath>
+        <m:r>
+          <w:rPr>
+            <w:rFonts w:ascii="Cambria Math" w:hAnsi="Cambria Math" w:cs="Cambria Math"/>
+            <w:szCs w:val="24"/>
+          </w:rPr>
+          <m:t>x</m:t>
+        </m:r>
+        <m:r>
+          <m:rPr>
+            <m:sty m:val="p"/>
+          </m:rPr>
+          <w:rPr>
+            <w:rFonts w:ascii="Cambria Math" w:hAnsi="Cambria Math" w:cs="Cambria Math"/>
+            <w:szCs w:val="24"/>
+          </w:rPr>
+          <m:t>=</m:t>
+        </m:r>
+        <m:f>
+          <m:fPr>
+            <m:ctrlPr>
+              <w:rPr>
+                <w:rFonts w:ascii="Cambria Math" w:hAnsi="Cambria Math" w:cs="宋体"/>
+                <w:szCs w:val="24"/>
+              </w:rPr>
+            </m:ctrlPr>
+          </m:fPr>
+          <m:num>
+            <m:r>
+              <m:rPr>
+                <m:sty m:val="p"/>
+              </m:rPr>
+              <w:rPr>
+                <w:rFonts w:ascii="Cambria Math" w:hAnsi="Cambria Math" w:cs="Cambria Math"/>
+                <w:szCs w:val="24"/>
+              </w:rPr>
+              <m:t>-</m:t>
+            </m:r>
+            <m:r>
+              <w:rPr>
+                <w:rFonts w:ascii="Cambria Math" w:hAnsi="Cambria Math" w:cs="Cambria Math"/>
+                <w:szCs w:val="24"/>
+              </w:rPr>
+              <m:t>b</m:t>
+            </m:r>
+            <m:r>
+              <m:rPr>
+                <m:sty m:val="p"/>
+              </m:rPr>
+              <w:rPr>
+                <w:rFonts w:ascii="Cambria Math" w:hAnsi="Cambria Math" w:cs="Cambria Math"/>
+                <w:szCs w:val="24"/>
+              </w:rPr>
+              <m:t>±</m:t>
+            </m:r>
+            <m:rad>
+              <m:radPr>
+                <m:degHide m:val="1"/>
+                <m:ctrlPr>
+                  <w:rPr>
+                    <w:rFonts w:ascii="Cambria Math" w:hAnsi="Cambria Math" w:cs="宋体"/>
+                    <w:szCs w:val="24"/>
+                  </w:rPr>
+                </m:ctrlPr>
+              </m:radPr>
+              <m:deg/>
+              <m:e>
+                <m:sSup>
+                  <m:sSupPr>
+                    <m:ctrlPr>
+                      <w:rPr>
+                        <w:rFonts w:ascii="Cambria Math" w:hAnsi="Cambria Math" w:cs="宋体"/>
+                        <w:szCs w:val="24"/>
+                      </w:rPr>
+                    </m:ctrlPr>
+                  </m:sSupPr>
+                  <m:e>
+                    <m:r>
+                      <w:rPr>
+                        <w:rFonts w:ascii="Cambria Math" w:hAnsi="Cambria Math" w:cs="Cambria Math"/>
+                        <w:szCs w:val="24"/>
+                      </w:rPr>
+                      <m:t>b</m:t>
+                    </m:r>
+                  </m:e>
+                  <m:sup>
+                    <m:r>
+                      <m:rPr>
+                        <m:sty m:val="p"/>
+                      </m:rPr>
+                      <w:rPr>
+                        <w:rFonts w:ascii="Cambria Math" w:hAnsi="Cambria Math" w:cs="Cambria Math"/>
+                        <w:szCs w:val="24"/>
+                      </w:rPr>
+                      <m:t>2</m:t>
+                    </m:r>
+                  </m:sup>
+                </m:sSup>
+                <m:r>
+                  <m:rPr>
+                    <m:sty m:val="p"/>
+                  </m:rPr>
+                  <w:rPr>
+                    <w:rFonts w:ascii="Cambria Math" w:hAnsi="Cambria Math" w:cs="Cambria Math"/>
+                    <w:szCs w:val="24"/>
+                  </w:rPr>
+                  <m:t>-4</m:t>
+                </m:r>
+                <m:r>
+                  <w:rPr>
+                    <w:rFonts w:ascii="Cambria Math" w:hAnsi="Cambria Math" w:cs="Cambria Math"/>
+                    <w:szCs w:val="24"/>
+                  </w:rPr>
+                  <m:t>ac</m:t>
+                </m:r>
+              </m:e>
+            </m:rad>
+          </m:num>
+          <m:den>
+            <m:r>
+              <m:rPr>
+                <m:sty m:val="p"/>
+              </m:rPr>
+              <w:rPr>
+                <w:rFonts w:ascii="Cambria Math" w:hAnsi="Cambria Math" w:cs="Cambria Math"/>
+                <w:szCs w:val="24"/>
+              </w:rPr>
+              <m:t>2</m:t>
+            </m:r>
+            <m:r>
+              <w:rPr>
+                <w:rFonts w:ascii="Cambria Math" w:hAnsi="Cambria Math" w:cs="Cambria Math"/>
+                <w:szCs w:val="24"/>
+              </w:rPr>
+              <m:t>a</m:t>
+            </m:r>
+          </m:den>
+        </m:f>
+      </m:oMath>
+    </w:p>
+    <w:p>
+      <w:pPr>
+        <w:numPr>
           <w:ilvl w:val="1"/>
           <w:numId w:val="2"/>
         </w:numPr>
@@ -1055,7 +1501,6 @@
       <w:pPr>
         <w:ind w:firstLine="480"/>
         <w:rPr>
-          <w:rFonts w:hint="eastAsia"/>
           <w:szCs w:val="24"/>
         </w:rPr>
       </w:pPr>
@@ -1369,7 +1814,7 @@
         </w:rPr>
         <w:t>由</w:t>
       </w:r>
-      <w:hyperlink r:id="rId9" w:history="1">
+      <w:hyperlink r:id="rId10" w:history="1">
         <w:r>
           <w:rPr>
             <w:rStyle w:val="a6"/>
@@ -1854,7 +2299,7 @@
                     </pic:cNvPicPr>
                   </pic:nvPicPr>
                   <pic:blipFill>
-                    <a:blip r:embed="rId10"/>
+                    <a:blip r:embed="rId11"/>
                     <a:stretch>
                       <a:fillRect/>
                     </a:stretch>
@@ -2282,9 +2727,6 @@
       <w:pPr>
         <w:pStyle w:val="a3"/>
         <w:ind w:firstLine="400"/>
-        <w:rPr>
-          <w:rFonts w:hint="eastAsia"/>
-        </w:rPr>
       </w:pPr>
       <w:r>
         <w:rPr>
@@ -3279,7 +3721,7 @@
             <wp:cNvGraphicFramePr/>
             <a:graphic xmlns:a="http://schemas.openxmlformats.org/drawingml/2006/main">
               <a:graphicData uri="http://schemas.openxmlformats.org/drawingml/2006/chart">
-                <c:chart xmlns:c="http://schemas.openxmlformats.org/drawingml/2006/chart" xmlns:r="http://schemas.openxmlformats.org/officeDocument/2006/relationships" r:id="rId11"/>
+                <c:chart xmlns:c="http://schemas.openxmlformats.org/drawingml/2006/chart" xmlns:r="http://schemas.openxmlformats.org/officeDocument/2006/relationships" r:id="rId12"/>
               </a:graphicData>
             </a:graphic>
           </wp:inline>
@@ -3290,11 +3732,8 @@
       <w:pPr>
         <w:pStyle w:val="a3"/>
         <w:ind w:firstLine="400"/>
-        <w:rPr>
-          <w:rFonts w:hint="eastAsia"/>
-        </w:rPr>
       </w:pPr>
-      <w:hyperlink r:id="rId12" w:history="1">
+      <w:hyperlink r:id="rId13" w:history="1">
         <w:r>
           <w:rPr>
             <w:rStyle w:val="a6"/>
@@ -3364,7 +3803,7 @@
             <wp:cNvGraphicFramePr/>
             <a:graphic xmlns:a="http://schemas.openxmlformats.org/drawingml/2006/main">
               <a:graphicData uri="http://schemas.openxmlformats.org/drawingml/2006/chart">
-                <c:chart xmlns:c="http://schemas.openxmlformats.org/drawingml/2006/chart" xmlns:r="http://schemas.openxmlformats.org/officeDocument/2006/relationships" r:id="rId13"/>
+                <c:chart xmlns:c="http://schemas.openxmlformats.org/drawingml/2006/chart" xmlns:r="http://schemas.openxmlformats.org/officeDocument/2006/relationships" r:id="rId14"/>
               </a:graphicData>
             </a:graphic>
           </wp:inline>
@@ -3375,9 +3814,6 @@
       <w:pPr>
         <w:pStyle w:val="a3"/>
         <w:ind w:firstLine="400"/>
-        <w:rPr>
-          <w:rFonts w:hint="eastAsia"/>
-        </w:rPr>
       </w:pPr>
       <w:r>
         <w:rPr>
@@ -3432,12 +3868,12 @@
       </w:r>
     </w:p>
     <w:sectPr>
-      <w:headerReference w:type="even" r:id="rId14"/>
-      <w:headerReference w:type="default" r:id="rId15"/>
-      <w:footerReference w:type="even" r:id="rId16"/>
-      <w:footerReference w:type="default" r:id="rId17"/>
-      <w:headerReference w:type="first" r:id="rId18"/>
-      <w:footerReference w:type="first" r:id="rId19"/>
+      <w:headerReference w:type="even" r:id="rId15"/>
+      <w:headerReference w:type="default" r:id="rId16"/>
+      <w:footerReference w:type="even" r:id="rId17"/>
+      <w:footerReference w:type="default" r:id="rId18"/>
+      <w:headerReference w:type="first" r:id="rId19"/>
+      <w:footerReference w:type="first" r:id="rId20"/>
       <w:pgSz w:w="11907" w:h="16840"/>
       <w:pgMar w:top="1418" w:right="1361" w:bottom="623" w:left="1361" w:header="851" w:footer="992" w:gutter="0"/>
       <w:cols w:space="720"/>
@@ -3642,9 +4078,6 @@
   <w:p>
     <w:pPr>
       <w:ind w:right="360" w:firstLine="480"/>
-      <w:rPr>
-        <w:rFonts w:hint="eastAsia"/>
-      </w:rPr>
     </w:pPr>
     <w:r>
       <w:rPr>
@@ -3816,27 +4249,12 @@
   <w:p>
     <w:pPr>
       <w:ind w:firstLine="480"/>
-      <w:rPr>
-        <w:rFonts w:hint="eastAsia"/>
-      </w:rPr>
     </w:pPr>
     <w:r>
       <w:rPr>
         <w:rFonts w:hint="eastAsia"/>
       </w:rPr>
-      <w:t>页</w:t>
-    </w:r>
-    <w:r>
-      <w:rPr>
-        <w:rFonts w:hint="eastAsia"/>
-      </w:rPr>
-      <w:t>脚</w:t>
-    </w:r>
-    <w:r>
-      <w:rPr>
-        <w:rFonts w:hint="eastAsia"/>
-      </w:rPr>
-      <w:t>加公式</w:t>
+      <w:t>页脚加公式</w:t>
     </w:r>
     <m:oMath>
       <m:r>
@@ -4897,7 +5315,7 @@
   <w:style w:type="paragraph" w:default="1" w:styleId="a">
     <w:name w:val="Normal"/>
     <w:qFormat/>
-    <w:rsid w:val="00DF7B5F"/>
+    <w:rsid w:val="006D222D"/>
     <w:pPr>
       <w:widowControl w:val="0"/>
       <w:spacing w:line="360" w:lineRule="auto"/>
@@ -5406,6 +5824,16 @@
       <w:color w:val="605E5C"/>
       <w:shd w:val="clear" w:color="auto" w:fill="E1DFDD"/>
     </w:rPr>
+  </w:style>
+  <w:style w:type="paragraph" w:styleId="af0">
+    <w:name w:val="List Paragraph"/>
+    <w:basedOn w:val="a"/>
+    <w:uiPriority w:val="99"/>
+    <w:unhideWhenUsed/>
+    <w:rsid w:val="006D222D"/>
+    <w:pPr>
+      <w:ind w:firstLine="420"/>
+    </w:pPr>
   </w:style>
 </w:styles>
 </file>

</xml_diff>